<commit_message>
Bug report: drop code locations
</commit_message>
<xml_diff>
--- a/docs/qa-seeded-bugs/Inventory-Bug-Report.docx
+++ b/docs/qa-seeded-bugs/Inventory-Bug-Report.docx
@@ -91,17 +91,6 @@
       </w:r>
     </w:p>
     <w:p>
-      <w:r>
-        <w:rPr>
-          <w:b/>
-        </w:rPr>
-        <w:t xml:space="preserve">Where it breaks: </w:t>
-      </w:r>
-      <w:r>
-        <w:t>src/pages/PurchaseOrders.jsx, line 115</w:t>
-      </w:r>
-    </w:p>
-    <w:p>
       <w:pPr>
         <w:pStyle w:val="Heading1"/>
         <w:pageBreakBefore/>
@@ -182,17 +171,6 @@
       </w:r>
     </w:p>
     <w:p>
-      <w:r>
-        <w:rPr>
-          <w:b/>
-        </w:rPr>
-        <w:t xml:space="preserve">Where it breaks: </w:t>
-      </w:r>
-      <w:r>
-        <w:t>src/pages/Suppliers.jsx, line 25</w:t>
-      </w:r>
-    </w:p>
-    <w:p>
       <w:pPr>
         <w:pStyle w:val="Heading1"/>
         <w:pageBreakBefore/>
@@ -262,17 +240,6 @@
             </a:graphic>
           </wp:inline>
         </w:drawing>
-      </w:r>
-    </w:p>
-    <w:p>
-      <w:r>
-        <w:rPr>
-          <w:b/>
-        </w:rPr>
-        <w:t xml:space="preserve">Where it breaks: </w:t>
-      </w:r>
-      <w:r>
-        <w:t>src/pages/AlertCenter.jsx, line 96</w:t>
       </w:r>
     </w:p>
     <w:p>
@@ -356,17 +323,6 @@
       </w:r>
     </w:p>
     <w:p>
-      <w:r>
-        <w:rPr>
-          <w:b/>
-        </w:rPr>
-        <w:t xml:space="preserve">Where it breaks: </w:t>
-      </w:r>
-      <w:r>
-        <w:t>src/pages/InventoryOverview.jsx, line 202</w:t>
-      </w:r>
-    </w:p>
-    <w:p>
       <w:pPr>
         <w:pStyle w:val="Heading1"/>
         <w:pageBreakBefore/>
@@ -444,17 +400,6 @@
             </a:graphic>
           </wp:inline>
         </w:drawing>
-      </w:r>
-    </w:p>
-    <w:p>
-      <w:r>
-        <w:rPr>
-          <w:b/>
-        </w:rPr>
-        <w:t xml:space="preserve">Where it breaks: </w:t>
-      </w:r>
-      <w:r>
-        <w:t>src/pages/Products.jsx, line 372</w:t>
       </w:r>
     </w:p>
     <w:p>
@@ -538,17 +483,6 @@
       </w:r>
     </w:p>
     <w:p>
-      <w:r>
-        <w:rPr>
-          <w:b/>
-        </w:rPr>
-        <w:t xml:space="preserve">Where it breaks: </w:t>
-      </w:r>
-      <w:r>
-        <w:t>src/pages/sales/Customers.jsx, line 186</w:t>
-      </w:r>
-    </w:p>
-    <w:p>
       <w:pPr>
         <w:pStyle w:val="Heading1"/>
         <w:pageBreakBefore/>
@@ -626,17 +560,6 @@
             </a:graphic>
           </wp:inline>
         </w:drawing>
-      </w:r>
-    </w:p>
-    <w:p>
-      <w:r>
-        <w:rPr>
-          <w:b/>
-        </w:rPr>
-        <w:t xml:space="preserve">Where it breaks: </w:t>
-      </w:r>
-      <w:r>
-        <w:t>src/components/dashboard/SupplierSpendWidget.jsx, line 56</w:t>
       </w:r>
     </w:p>
     <w:sectPr>

</xml_diff>

<commit_message>
QA practice: 10 major seeded bugs (screen-only, nothing saves wrong) and the bug report in docs/qa-seeded-bugs. Never merge into main.
</commit_message>
<xml_diff>
--- a/docs/qa-seeded-bugs/Inventory-Bug-Report.docx
+++ b/docs/qa-seeded-bugs/Inventory-Bug-Report.docx
@@ -16,7 +16,7 @@
         <w:pStyle w:val="Heading1"/>
       </w:pPr>
       <w:r>
-        <w:t>BUG-01: Purchase order search not working with capital letters</w:t>
+        <w:t>BUG-01: Product page crashes when opened</w:t>
       </w:r>
     </w:p>
     <w:p>
@@ -32,7 +32,7 @@
         <w:ind w:left="360"/>
       </w:pPr>
       <w:r>
-        <w:t>1. Go to Purchase Orders.</w:t>
+        <w:t>1. Go to Products.</w:t>
       </w:r>
     </w:p>
     <w:p>
@@ -40,7 +40,7 @@
         <w:ind w:left="360"/>
       </w:pPr>
       <w:r>
-        <w:t>2. Type PO-000002 in the search box.</w:t>
+        <w:t>2. Click any product (for example Kota Doria Saree).</w:t>
       </w:r>
     </w:p>
     <w:p>
@@ -51,7 +51,7 @@
         <w:t xml:space="preserve">Description: </w:t>
       </w:r>
       <w:r>
-        <w:t>PO-000002 should come in the list, but it shows "No purchase orders found". It works only if we type in small letters.</w:t>
+        <w:t>The product page should open with its details, but the screen shows "Something went wrong" and nothing else. No product can be opened.</w:t>
       </w:r>
     </w:p>
     <w:p>
@@ -67,7 +67,7 @@
               <a:graphicData uri="http://schemas.openxmlformats.org/drawingml/2006/picture">
                 <pic:pic>
                   <pic:nvPicPr>
-                    <pic:cNvPr id="0" name="BUG-01-po-search-actual.png"/>
+                    <pic:cNvPr id="0" name="BUG-01-product-page-crash.png"/>
                     <pic:cNvPicPr/>
                   </pic:nvPicPr>
                   <pic:blipFill>
@@ -96,7 +96,7 @@
         <w:pageBreakBefore/>
       </w:pPr>
       <w:r>
-        <w:t>BUG-02: Supplier search not finding supplier by name</w:t>
+        <w:t>BUG-02: Purchase order line totals are wrong</w:t>
       </w:r>
     </w:p>
     <w:p>
@@ -112,7 +112,7 @@
         <w:ind w:left="360"/>
       </w:pPr>
       <w:r>
-        <w:t>1. Go to Purchase Orders &gt; Suppliers.</w:t>
+        <w:t>1. Go to Purchase Orders.</w:t>
       </w:r>
     </w:p>
     <w:p>
@@ -120,7 +120,7 @@
         <w:ind w:left="360"/>
       </w:pPr>
       <w:r>
-        <w:t>2. Type Kanchi in the search box.</w:t>
+        <w:t>2. Open PO-000002.</w:t>
       </w:r>
     </w:p>
     <w:p>
@@ -131,7 +131,7 @@
         <w:t xml:space="preserve">Description: </w:t>
       </w:r>
       <w:r>
-        <w:t>Kanchi Weavers should come, but it shows "No suppliers found".</w:t>
+        <w:t>Total for 8 pieces at ₹841 should be ₹6,728, but it shows ₹849. Every line adds the price and quantity instead of multiplying them. The Grand Total (₹16,820) does not match the lines.</w:t>
       </w:r>
     </w:p>
     <w:p>
@@ -147,7 +147,7 @@
               <a:graphicData uri="http://schemas.openxmlformats.org/drawingml/2006/picture">
                 <pic:pic>
                   <pic:nvPicPr>
-                    <pic:cNvPr id="0" name="BUG-02-supplier-search-actual.png"/>
+                    <pic:cNvPr id="0" name="BUG-02-po-line-total.png"/>
                     <pic:cNvPicPr/>
                   </pic:nvPicPr>
                   <pic:blipFill>
@@ -176,7 +176,7 @@
         <w:pageBreakBefore/>
       </w:pPr>
       <w:r>
-        <w:t>BUG-03: Out of Stock count showing -1</w:t>
+        <w:t>BUG-03: Inventory Total Value shows the price of one piece</w:t>
       </w:r>
     </w:p>
     <w:p>
@@ -192,7 +192,15 @@
         <w:ind w:left="360"/>
       </w:pPr>
       <w:r>
-        <w:t>1. Go to Inventory &gt; Stock alerts.</w:t>
+        <w:t>1. Go to Inventory.</w:t>
+      </w:r>
+    </w:p>
+    <w:p>
+      <w:pPr>
+        <w:ind w:left="360"/>
+      </w:pPr>
+      <w:r>
+        <w:t>2. See the Total Value column for Kanchipuram Silk Saree (SAR-KAN-RED, 13 in stock).</w:t>
       </w:r>
     </w:p>
     <w:p>
@@ -203,7 +211,7 @@
         <w:t xml:space="preserve">Description: </w:t>
       </w:r>
       <w:r>
-        <w:t>Out of Stock tab should show (0), but it shows (-1).</w:t>
+        <w:t>Total Value should be ₹64,090 (13 x ₹4,930), but it shows ₹4,930. Every row shows the cost of one piece. Sold-out items show a value even with 0 stock.</w:t>
       </w:r>
     </w:p>
     <w:p>
@@ -219,7 +227,7 @@
               <a:graphicData uri="http://schemas.openxmlformats.org/drawingml/2006/picture">
                 <pic:pic>
                   <pic:nvPicPr>
-                    <pic:cNvPr id="0" name="BUG-03-out-of-stock-count-actual.png"/>
+                    <pic:cNvPr id="0" name="BUG-03-inventory-total-value.png"/>
                     <pic:cNvPicPr/>
                   </pic:nvPicPr>
                   <pic:blipFill>
@@ -248,7 +256,7 @@
         <w:pageBreakBefore/>
       </w:pPr>
       <w:r>
-        <w:t>BUG-04: Zero stock not showing in red</w:t>
+        <w:t>BUG-04: Top search finds nothing</w:t>
       </w:r>
     </w:p>
     <w:p>
@@ -264,7 +272,7 @@
         <w:ind w:left="360"/>
       </w:pPr>
       <w:r>
-        <w:t>1. Go to Inventory.</w:t>
+        <w:t>1. Type KUR-COT-BLU-M in the search box at the top.</w:t>
       </w:r>
     </w:p>
     <w:p>
@@ -272,7 +280,7 @@
         <w:ind w:left="360"/>
       </w:pPr>
       <w:r>
-        <w:t>2. See Stock Qty of Anarkali Suit Set.</w:t>
+        <w:t>2. Press Enter.</w:t>
       </w:r>
     </w:p>
     <w:p>
@@ -283,7 +291,7 @@
         <w:t xml:space="preserve">Description: </w:t>
       </w:r>
       <w:r>
-        <w:t>Stock 0 should show in red, but it shows in black like other items.</w:t>
+        <w:t>It should open the Cotton Kurti product, but it shows "Nothing found". Search fails for every product name, SKU and barcode.</w:t>
       </w:r>
     </w:p>
     <w:p>
@@ -299,7 +307,7 @@
               <a:graphicData uri="http://schemas.openxmlformats.org/drawingml/2006/picture">
                 <pic:pic>
                   <pic:nvPicPr>
-                    <pic:cNvPr id="0" name="BUG-04-zero-stock-colour-actual.png"/>
+                    <pic:cNvPr id="0" name="BUG-04-search-finds-nothing.png"/>
                     <pic:cNvPicPr/>
                   </pic:nvPicPr>
                   <pic:blipFill>
@@ -328,7 +336,7 @@
         <w:pageBreakBefore/>
       </w:pPr>
       <w:r>
-        <w:t>BUG-05: Stock Units showing wrong number in Products</w:t>
+        <w:t>BUG-05: Add Customer does not accept a correct mobile number</w:t>
       </w:r>
     </w:p>
     <w:p>
@@ -344,7 +352,7 @@
         <w:ind w:left="360"/>
       </w:pPr>
       <w:r>
-        <w:t>1. Go to Products.</w:t>
+        <w:t>1. Go to Customers.</w:t>
       </w:r>
     </w:p>
     <w:p>
@@ -352,7 +360,15 @@
         <w:ind w:left="360"/>
       </w:pPr>
       <w:r>
-        <w:t>2. See Stock Units of Chanderi Cotton Saree.</w:t>
+        <w:t>2. Click Add customer.</w:t>
+      </w:r>
+    </w:p>
+    <w:p>
+      <w:pPr>
+        <w:ind w:left="360"/>
+      </w:pPr>
+      <w:r>
+        <w:t>3. Enter phone 9848022338 and name Ravi Kumar, then click Add customer.</w:t>
       </w:r>
     </w:p>
     <w:p>
@@ -363,7 +379,7 @@
         <w:t xml:space="preserve">Description: </w:t>
       </w:r>
       <w:r>
-        <w:t>Stock Units should show 7, but it shows 2 (same as Variants). All rows have this problem.</w:t>
+        <w:t>The customer should be saved, but it says "An Indian mobile number starts with 6, 7, 8 or 9" even though the number starts with 9. No new customer can be added.</w:t>
       </w:r>
     </w:p>
     <w:p>
@@ -379,7 +395,7 @@
               <a:graphicData uri="http://schemas.openxmlformats.org/drawingml/2006/picture">
                 <pic:pic>
                   <pic:nvPicPr>
-                    <pic:cNvPr id="0" name="BUG-05-products-stock-units-actual.png"/>
+                    <pic:cNvPr id="0" name="BUG-05-add-customer-phone.png"/>
                     <pic:cNvPicPr/>
                   </pic:nvPicPr>
                   <pic:blipFill>
@@ -408,7 +424,7 @@
         <w:pageBreakBefore/>
       </w:pPr>
       <w:r>
-        <w:t>BUG-06: Customer created date showing wrong month</w:t>
+        <w:t>BUG-06: Low Stock filter shows all items</w:t>
       </w:r>
     </w:p>
     <w:p>
@@ -424,7 +440,7 @@
         <w:ind w:left="360"/>
       </w:pPr>
       <w:r>
-        <w:t>1. Go to Customers.</w:t>
+        <w:t>1. Go to Inventory.</w:t>
       </w:r>
     </w:p>
     <w:p>
@@ -432,7 +448,7 @@
         <w:ind w:left="360"/>
       </w:pPr>
       <w:r>
-        <w:t>2. See the Created date under any customer.</w:t>
+        <w:t>2. In the status filter choose Low Stock.</w:t>
       </w:r>
     </w:p>
     <w:p>
@@ -443,7 +459,7 @@
         <w:t xml:space="preserve">Description: </w:t>
       </w:r>
       <w:r>
-        <w:t>Customer was created on 6/10/2026, but it shows 6/9/2026.</w:t>
+        <w:t>Only the 4 low stock items should show, but Healthy and Out of Stock items also show. The filter does nothing.</w:t>
       </w:r>
     </w:p>
     <w:p>
@@ -459,7 +475,7 @@
               <a:graphicData uri="http://schemas.openxmlformats.org/drawingml/2006/picture">
                 <pic:pic>
                   <pic:nvPicPr>
-                    <pic:cNvPr id="0" name="BUG-06-customer-created-date-actual.png"/>
+                    <pic:cNvPr id="0" name="BUG-06-low-stock-filter.png"/>
                     <pic:cNvPicPr/>
                   </pic:nvPicPr>
                   <pic:blipFill>
@@ -488,7 +504,7 @@
         <w:pageBreakBefore/>
       </w:pPr>
       <w:r>
-        <w:t>BUG-07: Top Suppliers rank starting from #0</w:t>
+        <w:t>BUG-07: Stock alerts: Low Stock tab is always empty</w:t>
       </w:r>
     </w:p>
     <w:p>
@@ -504,7 +520,7 @@
         <w:ind w:left="360"/>
       </w:pPr>
       <w:r>
-        <w:t>1. Go to Dashboard &gt; Analytics.</w:t>
+        <w:t>1. Go to Inventory &gt; Stock alerts.</w:t>
       </w:r>
     </w:p>
     <w:p>
@@ -512,7 +528,7 @@
         <w:ind w:left="360"/>
       </w:pPr>
       <w:r>
-        <w:t>2. See the Top Suppliers card.</w:t>
+        <w:t>2. Click the Low Stock tab.</w:t>
       </w:r>
     </w:p>
     <w:p>
@@ -523,7 +539,7 @@
         <w:t xml:space="preserve">Description: </w:t>
       </w:r>
       <w:r>
-        <w:t>First supplier should be #1, but it shows #0.</w:t>
+        <w:t>It should show 4 low stock items, but it shows Low Stock (0) and "No alerts in this category".</w:t>
       </w:r>
     </w:p>
     <w:p>
@@ -539,11 +555,251 @@
               <a:graphicData uri="http://schemas.openxmlformats.org/drawingml/2006/picture">
                 <pic:pic>
                   <pic:nvPicPr>
-                    <pic:cNvPr id="0" name="BUG-07-supplier-rank-actual.png"/>
+                    <pic:cNvPr id="0" name="BUG-07-alerts-low-stock-empty.png"/>
                     <pic:cNvPicPr/>
                   </pic:nvPicPr>
                   <pic:blipFill>
                     <a:blip r:embed="rId15"/>
+                    <a:stretch>
+                      <a:fillRect/>
+                    </a:stretch>
+                  </pic:blipFill>
+                  <pic:spPr>
+                    <a:xfrm>
+                      <a:off x="0" y="0"/>
+                      <a:ext cx="5760720" cy="3795496"/>
+                    </a:xfrm>
+                    <a:prstGeom prst="rect"/>
+                  </pic:spPr>
+                </pic:pic>
+              </a:graphicData>
+            </a:graphic>
+          </wp:inline>
+        </w:drawing>
+      </w:r>
+    </w:p>
+    <w:p>
+      <w:pPr>
+        <w:pStyle w:val="Heading1"/>
+        <w:pageBreakBefore/>
+      </w:pPr>
+      <w:r>
+        <w:t>BUG-08: Purchase order status filter shows the wrong orders</w:t>
+      </w:r>
+    </w:p>
+    <w:p>
+      <w:r>
+        <w:rPr>
+          <w:b/>
+        </w:rPr>
+        <w:t>Steps:</w:t>
+      </w:r>
+    </w:p>
+    <w:p>
+      <w:pPr>
+        <w:ind w:left="360"/>
+      </w:pPr>
+      <w:r>
+        <w:t>1. Go to Purchase Orders.</w:t>
+      </w:r>
+    </w:p>
+    <w:p>
+      <w:pPr>
+        <w:ind w:left="360"/>
+      </w:pPr>
+      <w:r>
+        <w:t>2. In the status filter choose Received.</w:t>
+      </w:r>
+    </w:p>
+    <w:p>
+      <w:r>
+        <w:rPr>
+          <w:b/>
+        </w:rPr>
+        <w:t xml:space="preserve">Description: </w:t>
+      </w:r>
+      <w:r>
+        <w:t>PO-000001 and PO-000002 (Received) should show, but it shows PO-000003 (Sent) and PO-000004 (Draft). It shows every order except the chosen status.</w:t>
+      </w:r>
+    </w:p>
+    <w:p>
+      <w:r>
+        <w:drawing>
+          <wp:inline xmlns:a="http://schemas.openxmlformats.org/drawingml/2006/main" xmlns:pic="http://schemas.openxmlformats.org/drawingml/2006/picture">
+            <wp:extent cx="5760720" cy="3795496"/>
+            <wp:docPr id="8" name="Picture 8"/>
+            <wp:cNvGraphicFramePr>
+              <a:graphicFrameLocks noChangeAspect="1"/>
+            </wp:cNvGraphicFramePr>
+            <a:graphic>
+              <a:graphicData uri="http://schemas.openxmlformats.org/drawingml/2006/picture">
+                <pic:pic>
+                  <pic:nvPicPr>
+                    <pic:cNvPr id="0" name="BUG-08-po-status-filter.png"/>
+                    <pic:cNvPicPr/>
+                  </pic:nvPicPr>
+                  <pic:blipFill>
+                    <a:blip r:embed="rId16"/>
+                    <a:stretch>
+                      <a:fillRect/>
+                    </a:stretch>
+                  </pic:blipFill>
+                  <pic:spPr>
+                    <a:xfrm>
+                      <a:off x="0" y="0"/>
+                      <a:ext cx="5760720" cy="3795496"/>
+                    </a:xfrm>
+                    <a:prstGeom prst="rect"/>
+                  </pic:spPr>
+                </pic:pic>
+              </a:graphicData>
+            </a:graphic>
+          </wp:inline>
+        </w:drawing>
+      </w:r>
+    </w:p>
+    <w:p>
+      <w:pPr>
+        <w:pStyle w:val="Heading1"/>
+        <w:pageBreakBefore/>
+      </w:pPr>
+      <w:r>
+        <w:t>BUG-09: Customer page: Sales Orders tab is empty</w:t>
+      </w:r>
+    </w:p>
+    <w:p>
+      <w:r>
+        <w:rPr>
+          <w:b/>
+        </w:rPr>
+        <w:t>Steps:</w:t>
+      </w:r>
+    </w:p>
+    <w:p>
+      <w:pPr>
+        <w:ind w:left="360"/>
+      </w:pPr>
+      <w:r>
+        <w:t>1. Go to Customers.</w:t>
+      </w:r>
+    </w:p>
+    <w:p>
+      <w:pPr>
+        <w:ind w:left="360"/>
+      </w:pPr>
+      <w:r>
+        <w:t>2. Open Lakshmi Narayanan.</w:t>
+      </w:r>
+    </w:p>
+    <w:p>
+      <w:r>
+        <w:rPr>
+          <w:b/>
+        </w:rPr>
+        <w:t xml:space="preserve">Description: </w:t>
+      </w:r>
+      <w:r>
+        <w:t>The Sales Orders tab should list 3 orders (SO-000006, SO-000005, SO-000001), but it is empty. The orders show under the Dispatches tab instead.</w:t>
+      </w:r>
+    </w:p>
+    <w:p>
+      <w:r>
+        <w:drawing>
+          <wp:inline xmlns:a="http://schemas.openxmlformats.org/drawingml/2006/main" xmlns:pic="http://schemas.openxmlformats.org/drawingml/2006/picture">
+            <wp:extent cx="5760720" cy="3795496"/>
+            <wp:docPr id="9" name="Picture 9"/>
+            <wp:cNvGraphicFramePr>
+              <a:graphicFrameLocks noChangeAspect="1"/>
+            </wp:cNvGraphicFramePr>
+            <a:graphic>
+              <a:graphicData uri="http://schemas.openxmlformats.org/drawingml/2006/picture">
+                <pic:pic>
+                  <pic:nvPicPr>
+                    <pic:cNvPr id="0" name="BUG-09-customer-orders-tab.png"/>
+                    <pic:cNvPicPr/>
+                  </pic:nvPicPr>
+                  <pic:blipFill>
+                    <a:blip r:embed="rId17"/>
+                    <a:stretch>
+                      <a:fillRect/>
+                    </a:stretch>
+                  </pic:blipFill>
+                  <pic:spPr>
+                    <a:xfrm>
+                      <a:off x="0" y="0"/>
+                      <a:ext cx="5760720" cy="3795496"/>
+                    </a:xfrm>
+                    <a:prstGeom prst="rect"/>
+                  </pic:spPr>
+                </pic:pic>
+              </a:graphicData>
+            </a:graphic>
+          </wp:inline>
+        </w:drawing>
+      </w:r>
+    </w:p>
+    <w:p>
+      <w:pPr>
+        <w:pStyle w:val="Heading1"/>
+        <w:pageBreakBefore/>
+      </w:pPr>
+      <w:r>
+        <w:t>BUG-10: Sign out does not sign the user out</w:t>
+      </w:r>
+    </w:p>
+    <w:p>
+      <w:r>
+        <w:rPr>
+          <w:b/>
+        </w:rPr>
+        <w:t>Steps:</w:t>
+      </w:r>
+    </w:p>
+    <w:p>
+      <w:pPr>
+        <w:ind w:left="360"/>
+      </w:pPr>
+      <w:r>
+        <w:t>1. Click Sign out at the bottom left.</w:t>
+      </w:r>
+    </w:p>
+    <w:p>
+      <w:pPr>
+        <w:ind w:left="360"/>
+      </w:pPr>
+      <w:r>
+        <w:t>2. The login page opens. Now open the app address again (for example /dashboard).</w:t>
+      </w:r>
+    </w:p>
+    <w:p>
+      <w:r>
+        <w:rPr>
+          <w:b/>
+        </w:rPr>
+        <w:t xml:space="preserve">Description: </w:t>
+      </w:r>
+      <w:r>
+        <w:t>The user should have to sign in again, but the dashboard opens straight away. Anyone using the same computer after sign out gets into the shop.</w:t>
+      </w:r>
+    </w:p>
+    <w:p>
+      <w:r>
+        <w:drawing>
+          <wp:inline xmlns:a="http://schemas.openxmlformats.org/drawingml/2006/main" xmlns:pic="http://schemas.openxmlformats.org/drawingml/2006/picture">
+            <wp:extent cx="5760720" cy="3795496"/>
+            <wp:docPr id="10" name="Picture 10"/>
+            <wp:cNvGraphicFramePr>
+              <a:graphicFrameLocks noChangeAspect="1"/>
+            </wp:cNvGraphicFramePr>
+            <a:graphic>
+              <a:graphicData uri="http://schemas.openxmlformats.org/drawingml/2006/picture">
+                <pic:pic>
+                  <pic:nvPicPr>
+                    <pic:cNvPr id="0" name="BUG-10-sign-out.png"/>
+                    <pic:cNvPicPr/>
+                  </pic:nvPicPr>
+                  <pic:blipFill>
+                    <a:blip r:embed="rId18"/>
                     <a:stretch>
                       <a:fillRect/>
                     </a:stretch>

</xml_diff>